<commit_message>
Book 2 quick reference, decision tools and templates aligned with Model v0.8
Operational collection rate vs PAYGo PERFORM 2026 KPIs (T05 gains a
PERFORM_2026 sheet with numerator/denominator check); T01 memo shows the
evidence-based readiness decision beside the recommendation, provenance and
the IFRS statement; T02 adds a PERFORM item and a red flag; 'Lender view'
replaces the bankability step; source statuses (ESMAP pending, M-KOPA
conflicting, BBOXX pending); Book 2 branding; version 0.9 (pre-release).
All rebuilt workbooks recalculated in LibreOffice without errors.

Co-Authored-By: Claude Opus 5.5 <noreply@anthropic.com>
Claude-Session: https://claude.ai/code/session_0192koLK9F8fRH5Bfqszi1tY
</commit_message>
<xml_diff>
--- a/volumes/02-solar-home-systems/templates/AEF_V2_T01_Investment_Memo.docx
+++ b/volumes/02-solar-home-systems/templates/AEF_V2_T01_Investment_Memo.docx
@@ -24,7 +24,7 @@
                 <w:color w:val="E3C27A"/>
                 <w:sz w:val="18"/>
               </w:rPr>
-              <w:t>VOLUME 2  |  TEMPLATE T01</w:t>
+              <w:t>BOOK 2  |  TEMPLATE T01</w:t>
             </w:r>
           </w:p>
           <w:p>
@@ -337,7 +337,7 @@
                 <w:color w:val="0000FF"/>
                 <w:sz w:val="18"/>
               </w:rPr>
-              <w:t>[AEF SHS PAYGo model, version, file name]</w:t>
+              <w:t>[MODEL 2, PAYGo Company Financial and Investment Model: version, file name]</w:t>
             </w:r>
           </w:p>
         </w:tc>
@@ -369,7 +369,7 @@
                 <w:color w:val="0000FF"/>
                 <w:sz w:val="18"/>
               </w:rPr>
-              <w:t>[x of 23 gates met; not investment grade]</w:t>
+              <w:t>[x of 23 gates met, y of 13 critical; workbook decision GO / CONDITIONAL GO / STOP]</w:t>
             </w:r>
           </w:p>
         </w:tc>
@@ -733,7 +733,7 @@
         <w:rPr>
           <w:i/>
         </w:rPr>
-        <w:t>The contents list with page numbers is generated by Word when the document is opened.</w:t>
+        <w:t>Word builds the contents list with page numbers when the document is opened.</w:t>
       </w:r>
       <w:r>
         <w:fldChar w:fldCharType="end"/>
@@ -1807,7 +1807,7 @@
                 <w:b/>
                 <w:sz w:val="18"/>
               </w:rPr>
-              <w:t>Lowest trailing 3 month collection rate against covenant</w:t>
+              <w:t>Lowest trailing 3 month operational collection rate against covenant</w:t>
             </w:r>
           </w:p>
         </w:tc>
@@ -1864,7 +1864,7 @@
                 <w:b/>
                 <w:sz w:val="18"/>
               </w:rPr>
-              <w:t>Observed collection rate, last 12 months of history</w:t>
+              <w:t>Observed operational collection rate, last 12 months of history</w:t>
             </w:r>
           </w:p>
         </w:tc>
@@ -1904,7 +1904,7 @@
               <w:rPr>
                 <w:sz w:val="18"/>
               </w:rPr>
-              <w:t>Credit_Portfolio (Actual mode)</w:t>
+              <w:t>Credit_Portfolio (history summary)</w:t>
             </w:r>
           </w:p>
         </w:tc>
@@ -1921,7 +1921,64 @@
                 <w:b/>
                 <w:sz w:val="18"/>
               </w:rPr>
-              <w:t>Readiness gates met</w:t>
+              <w:t>PAYGo PERFORM 2026 KPIs, company reported (RR PvP, OR @2x)</w:t>
+            </w:r>
+          </w:p>
+        </w:tc>
+        <w:tc>
+          <w:tcPr>
+            <w:tcW w:type="dxa" w:w="1417"/>
+          </w:tcPr>
+          <w:p>
+            <w:r/>
+            <w:r>
+              <w:rPr>
+                <w:sz w:val="18"/>
+              </w:rPr>
+            </w:r>
+          </w:p>
+        </w:tc>
+        <w:tc>
+          <w:tcPr>
+            <w:tcW w:type="dxa" w:w="1417"/>
+          </w:tcPr>
+          <w:p>
+            <w:r/>
+            <w:r>
+              <w:rPr>
+                <w:sz w:val="18"/>
+              </w:rPr>
+            </w:r>
+          </w:p>
+        </w:tc>
+        <w:tc>
+          <w:tcPr>
+            <w:tcW w:type="dxa" w:w="2551"/>
+          </w:tcPr>
+          <w:p>
+            <w:r/>
+            <w:r>
+              <w:rPr>
+                <w:sz w:val="18"/>
+              </w:rPr>
+              <w:t>PERFORM_2026</w:t>
+            </w:r>
+          </w:p>
+        </w:tc>
+      </w:tr>
+      <w:tr>
+        <w:tc>
+          <w:tcPr>
+            <w:tcW w:type="dxa" w:w="3969"/>
+          </w:tcPr>
+          <w:p>
+            <w:r/>
+            <w:r>
+              <w:rPr>
+                <w:b/>
+                <w:sz w:val="18"/>
+              </w:rPr>
+              <w:t>Readiness gates met (critical gates met) and workbook decision</w:t>
             </w:r>
           </w:p>
         </w:tc>
@@ -3344,7 +3401,7 @@
           <w:color w:val="666666"/>
           <w:sz w:val="18"/>
         </w:rPr>
-        <w:t>Load the company history before any projection. Compare cohort repayment with plan at the same age; state whether the DPD buckets reconcile to the ledger and how DPD is measured.</w:t>
+        <w:t>Load the company history before any projection. Compare cohort repayment with plan at the same age; state whether the DPD buckets reconcile to the ledger and how DPD is measured. Report the five PAYGo PERFORM 2026 KPIs only as computed by the company on contract data (GOGLA Technical Guide, June 2026), with their numerators and denominators; write "not provided" otherwise. The collection rate is an operational metric, not a PERFORM KPI, and never stands in for the repayment rate.</w:t>
       </w:r>
     </w:p>
     <w:tbl>
@@ -3396,7 +3453,7 @@
                 <w:color w:val="FFFFFF"/>
                 <w:sz w:val="17"/>
               </w:rPr>
-              <w:t>Repayment at M12, observed</w:t>
+              <w:t>Cohort repayment ratio at M12, observed</w:t>
             </w:r>
           </w:p>
         </w:tc>
@@ -3974,7 +4031,7 @@
                 <w:b/>
                 <w:sz w:val="18"/>
               </w:rPr>
-              <w:t>Collection rate (trailing 3 months)</w:t>
+              <w:t>Operational collection rate (trailing 3 months)</w:t>
             </w:r>
           </w:p>
         </w:tc>
@@ -4270,6 +4327,301 @@
         <w:t>Present the calibrated case. Explain why EBITDA turns positive before operating cash flow does, and show the funding requirement by source.</w:t>
       </w:r>
     </w:p>
+    <w:p>
+      <w:r>
+        <w:rPr>
+          <w:i/>
+          <w:color w:val="666666"/>
+          <w:sz w:val="18"/>
+        </w:rPr>
+        <w:t>State the provenance of the inputs behind the case, as counted on the Start sheet of the model: model assumptions, company data, external evidence, calibrated assumptions and unverified inputs. Where revenue or credit losses are discussed, add: "This is an analytical modelling treatment and does not constitute a determination of the applicable accounting treatment under IFRS."</w:t>
+      </w:r>
+    </w:p>
+    <w:tbl>
+      <w:tblPr>
+        <w:tblStyle w:val="TableGrid"/>
+        <w:tblW w:type="auto" w:w="0"/>
+        <w:jc w:val="center"/>
+        <w:tblLook w:firstColumn="1" w:firstRow="1" w:lastColumn="0" w:lastRow="0" w:noHBand="0" w:noVBand="1" w:val="04A0"/>
+      </w:tblPr>
+      <w:tblGrid>
+        <w:gridCol w:w="3213"/>
+        <w:gridCol w:w="3213"/>
+        <w:gridCol w:w="3213"/>
+      </w:tblGrid>
+      <w:tr>
+        <w:trPr>
+          <w:tblHeader w:val="true"/>
+        </w:trPr>
+        <w:tc>
+          <w:tcPr>
+            <w:tcW w:type="dxa" w:w="3213"/>
+            <w:shd w:val="clear" w:color="auto" w:fill="0B3020"/>
+          </w:tcPr>
+          <w:p>
+            <w:r/>
+            <w:r>
+              <w:rPr>
+                <w:b/>
+                <w:color w:val="FFFFFF"/>
+                <w:sz w:val="17"/>
+              </w:rPr>
+              <w:t>Input provenance</w:t>
+            </w:r>
+          </w:p>
+        </w:tc>
+        <w:tc>
+          <w:tcPr>
+            <w:tcW w:type="dxa" w:w="3213"/>
+            <w:shd w:val="clear" w:color="auto" w:fill="0B3020"/>
+          </w:tcPr>
+          <w:p>
+            <w:r/>
+            <w:r>
+              <w:rPr>
+                <w:b/>
+                <w:color w:val="FFFFFF"/>
+                <w:sz w:val="17"/>
+              </w:rPr>
+              <w:t>Number of inputs</w:t>
+            </w:r>
+          </w:p>
+        </w:tc>
+        <w:tc>
+          <w:tcPr>
+            <w:tcW w:type="dxa" w:w="3213"/>
+            <w:shd w:val="clear" w:color="auto" w:fill="0B3020"/>
+          </w:tcPr>
+          <w:p>
+            <w:r/>
+            <w:r>
+              <w:rPr>
+                <w:b/>
+                <w:color w:val="FFFFFF"/>
+                <w:sz w:val="17"/>
+              </w:rPr>
+              <w:t>Main items</w:t>
+            </w:r>
+          </w:p>
+        </w:tc>
+      </w:tr>
+      <w:tr>
+        <w:tc>
+          <w:tcPr>
+            <w:tcW w:type="dxa" w:w="3213"/>
+          </w:tcPr>
+          <w:p>
+            <w:r/>
+            <w:r>
+              <w:rPr>
+                <w:b/>
+                <w:sz w:val="17"/>
+              </w:rPr>
+              <w:t>MODEL ASSUMPTION</w:t>
+            </w:r>
+          </w:p>
+        </w:tc>
+        <w:tc>
+          <w:tcPr>
+            <w:tcW w:type="dxa" w:w="3213"/>
+          </w:tcPr>
+          <w:p>
+            <w:r/>
+            <w:r>
+              <w:rPr>
+                <w:sz w:val="17"/>
+              </w:rPr>
+            </w:r>
+          </w:p>
+        </w:tc>
+        <w:tc>
+          <w:tcPr>
+            <w:tcW w:type="dxa" w:w="3213"/>
+          </w:tcPr>
+          <w:p>
+            <w:r/>
+            <w:r>
+              <w:rPr>
+                <w:sz w:val="17"/>
+              </w:rPr>
+            </w:r>
+          </w:p>
+        </w:tc>
+      </w:tr>
+      <w:tr>
+        <w:tc>
+          <w:tcPr>
+            <w:tcW w:type="dxa" w:w="3213"/>
+          </w:tcPr>
+          <w:p>
+            <w:r/>
+            <w:r>
+              <w:rPr>
+                <w:b/>
+                <w:sz w:val="17"/>
+              </w:rPr>
+              <w:t>COMPANY DATA</w:t>
+            </w:r>
+          </w:p>
+        </w:tc>
+        <w:tc>
+          <w:tcPr>
+            <w:tcW w:type="dxa" w:w="3213"/>
+          </w:tcPr>
+          <w:p>
+            <w:r/>
+            <w:r>
+              <w:rPr>
+                <w:sz w:val="17"/>
+              </w:rPr>
+            </w:r>
+          </w:p>
+        </w:tc>
+        <w:tc>
+          <w:tcPr>
+            <w:tcW w:type="dxa" w:w="3213"/>
+          </w:tcPr>
+          <w:p>
+            <w:r/>
+            <w:r>
+              <w:rPr>
+                <w:sz w:val="17"/>
+              </w:rPr>
+            </w:r>
+          </w:p>
+        </w:tc>
+      </w:tr>
+      <w:tr>
+        <w:tc>
+          <w:tcPr>
+            <w:tcW w:type="dxa" w:w="3213"/>
+          </w:tcPr>
+          <w:p>
+            <w:r/>
+            <w:r>
+              <w:rPr>
+                <w:b/>
+                <w:sz w:val="17"/>
+              </w:rPr>
+              <w:t>EXTERNAL EVIDENCE</w:t>
+            </w:r>
+          </w:p>
+        </w:tc>
+        <w:tc>
+          <w:tcPr>
+            <w:tcW w:type="dxa" w:w="3213"/>
+          </w:tcPr>
+          <w:p>
+            <w:r/>
+            <w:r>
+              <w:rPr>
+                <w:sz w:val="17"/>
+              </w:rPr>
+            </w:r>
+          </w:p>
+        </w:tc>
+        <w:tc>
+          <w:tcPr>
+            <w:tcW w:type="dxa" w:w="3213"/>
+          </w:tcPr>
+          <w:p>
+            <w:r/>
+            <w:r>
+              <w:rPr>
+                <w:sz w:val="17"/>
+              </w:rPr>
+            </w:r>
+          </w:p>
+        </w:tc>
+      </w:tr>
+      <w:tr>
+        <w:tc>
+          <w:tcPr>
+            <w:tcW w:type="dxa" w:w="3213"/>
+          </w:tcPr>
+          <w:p>
+            <w:r/>
+            <w:r>
+              <w:rPr>
+                <w:b/>
+                <w:sz w:val="17"/>
+              </w:rPr>
+              <w:t>CALIBRATED ASSUMPTION</w:t>
+            </w:r>
+          </w:p>
+        </w:tc>
+        <w:tc>
+          <w:tcPr>
+            <w:tcW w:type="dxa" w:w="3213"/>
+          </w:tcPr>
+          <w:p>
+            <w:r/>
+            <w:r>
+              <w:rPr>
+                <w:sz w:val="17"/>
+              </w:rPr>
+            </w:r>
+          </w:p>
+        </w:tc>
+        <w:tc>
+          <w:tcPr>
+            <w:tcW w:type="dxa" w:w="3213"/>
+          </w:tcPr>
+          <w:p>
+            <w:r/>
+            <w:r>
+              <w:rPr>
+                <w:sz w:val="17"/>
+              </w:rPr>
+            </w:r>
+          </w:p>
+        </w:tc>
+      </w:tr>
+      <w:tr>
+        <w:tc>
+          <w:tcPr>
+            <w:tcW w:type="dxa" w:w="3213"/>
+          </w:tcPr>
+          <w:p>
+            <w:r/>
+            <w:r>
+              <w:rPr>
+                <w:b/>
+                <w:sz w:val="17"/>
+              </w:rPr>
+              <w:t>UNVERIFIED</w:t>
+            </w:r>
+          </w:p>
+        </w:tc>
+        <w:tc>
+          <w:tcPr>
+            <w:tcW w:type="dxa" w:w="3213"/>
+          </w:tcPr>
+          <w:p>
+            <w:r/>
+            <w:r>
+              <w:rPr>
+                <w:sz w:val="17"/>
+              </w:rPr>
+            </w:r>
+          </w:p>
+        </w:tc>
+        <w:tc>
+          <w:tcPr>
+            <w:tcW w:type="dxa" w:w="3213"/>
+          </w:tcPr>
+          <w:p>
+            <w:r/>
+            <w:r>
+              <w:rPr>
+                <w:sz w:val="17"/>
+              </w:rPr>
+            </w:r>
+          </w:p>
+        </w:tc>
+      </w:tr>
+    </w:tbl>
+    <w:p/>
     <w:tbl>
       <w:tblPr>
         <w:tblStyle w:val="TableGrid"/>
@@ -4814,7 +5166,7 @@
                 <w:b/>
                 <w:sz w:val="17"/>
               </w:rPr>
-              <w:t>Collection rate</w:t>
+              <w:t>Operational collection rate</w:t>
             </w:r>
           </w:p>
         </w:tc>
@@ -5234,7 +5586,7 @@
                 <w:color w:val="FFFFFF"/>
                 <w:sz w:val="17"/>
               </w:rPr>
-              <w:t>Y5 collection rate</w:t>
+              <w:t>Y5 operational collection rate</w:t>
             </w:r>
           </w:p>
         </w:tc>
@@ -6018,7 +6370,7 @@
                 <w:b/>
                 <w:sz w:val="17"/>
               </w:rPr>
-              <w:t>Trailing 3 month collection rate</w:t>
+              <w:t>Trailing 3 month operational collection rate</w:t>
             </w:r>
           </w:p>
         </w:tc>
@@ -6818,7 +7170,7 @@
           <w:color w:val="666666"/>
           <w:sz w:val="18"/>
         </w:rPr>
-        <w:t>Use only usable records graded A to C. Ranges built on one or two peers are anecdotal; conflicting figures are excluded until primary filings are read.</w:t>
+        <w:t>Use a reference as a test only when its source status is VERIFIED or VERIFIED (HISTORICAL). Show the grade (A to D) and the status separately, with the period and the definition, and say whether the reference is comparable with the company's figure. Pending, unverified or conflicting figures are context only; a sector collection rate is not a PERFORM repayment rate. Ranges built on one or two peers are anecdotal.</w:t>
       </w:r>
     </w:p>
     <w:tbl>
@@ -6829,11 +7181,13 @@
         <w:tblLook w:firstColumn="1" w:firstRow="1" w:lastColumn="0" w:lastRow="0" w:noHBand="0" w:noVBand="1" w:val="04A0"/>
       </w:tblPr>
       <w:tblGrid>
-        <w:gridCol w:w="1928"/>
-        <w:gridCol w:w="1928"/>
-        <w:gridCol w:w="1928"/>
-        <w:gridCol w:w="1928"/>
-        <w:gridCol w:w="1928"/>
+        <w:gridCol w:w="1377"/>
+        <w:gridCol w:w="1377"/>
+        <w:gridCol w:w="1377"/>
+        <w:gridCol w:w="1377"/>
+        <w:gridCol w:w="1377"/>
+        <w:gridCol w:w="1377"/>
+        <w:gridCol w:w="1377"/>
       </w:tblGrid>
       <w:tr>
         <w:trPr>
@@ -6841,7 +7195,7 @@
         </w:trPr>
         <w:tc>
           <w:tcPr>
-            <w:tcW w:type="dxa" w:w="1928"/>
+            <w:tcW w:type="dxa" w:w="1377"/>
             <w:shd w:val="clear" w:color="auto" w:fill="0B3020"/>
           </w:tcPr>
           <w:p>
@@ -6858,7 +7212,7 @@
         </w:tc>
         <w:tc>
           <w:tcPr>
-            <w:tcW w:type="dxa" w:w="1928"/>
+            <w:tcW w:type="dxa" w:w="1377"/>
             <w:shd w:val="clear" w:color="auto" w:fill="0B3020"/>
           </w:tcPr>
           <w:p>
@@ -6875,7 +7229,7 @@
         </w:tc>
         <w:tc>
           <w:tcPr>
-            <w:tcW w:type="dxa" w:w="1928"/>
+            <w:tcW w:type="dxa" w:w="1377"/>
             <w:shd w:val="clear" w:color="auto" w:fill="0B3020"/>
           </w:tcPr>
           <w:p>
@@ -6886,13 +7240,13 @@
                 <w:color w:val="FFFFFF"/>
                 <w:sz w:val="17"/>
               </w:rPr>
-              <w:t>Reference</w:t>
-            </w:r>
-          </w:p>
-        </w:tc>
-        <w:tc>
-          <w:tcPr>
-            <w:tcW w:type="dxa" w:w="1928"/>
+              <w:t>Reference, period and definition</w:t>
+            </w:r>
+          </w:p>
+        </w:tc>
+        <w:tc>
+          <w:tcPr>
+            <w:tcW w:type="dxa" w:w="1377"/>
             <w:shd w:val="clear" w:color="auto" w:fill="0B3020"/>
           </w:tcPr>
           <w:p>
@@ -6903,13 +7257,13 @@
                 <w:color w:val="FFFFFF"/>
                 <w:sz w:val="17"/>
               </w:rPr>
-              <w:t>Grade and status</w:t>
-            </w:r>
-          </w:p>
-        </w:tc>
-        <w:tc>
-          <w:tcPr>
-            <w:tcW w:type="dxa" w:w="1928"/>
+              <w:t>Grade</w:t>
+            </w:r>
+          </w:p>
+        </w:tc>
+        <w:tc>
+          <w:tcPr>
+            <w:tcW w:type="dxa" w:w="1377"/>
             <w:shd w:val="clear" w:color="auto" w:fill="0B3020"/>
           </w:tcPr>
           <w:p>
@@ -6920,6 +7274,40 @@
                 <w:color w:val="FFFFFF"/>
                 <w:sz w:val="17"/>
               </w:rPr>
+              <w:t>Status</w:t>
+            </w:r>
+          </w:p>
+        </w:tc>
+        <w:tc>
+          <w:tcPr>
+            <w:tcW w:type="dxa" w:w="1377"/>
+            <w:shd w:val="clear" w:color="auto" w:fill="0B3020"/>
+          </w:tcPr>
+          <w:p>
+            <w:r/>
+            <w:r>
+              <w:rPr>
+                <w:b/>
+                <w:color w:val="FFFFFF"/>
+                <w:sz w:val="17"/>
+              </w:rPr>
+              <w:t>Comparable?</w:t>
+            </w:r>
+          </w:p>
+        </w:tc>
+        <w:tc>
+          <w:tcPr>
+            <w:tcW w:type="dxa" w:w="1377"/>
+            <w:shd w:val="clear" w:color="auto" w:fill="0B3020"/>
+          </w:tcPr>
+          <w:p>
+            <w:r/>
+            <w:r>
+              <w:rPr>
+                <w:b/>
+                <w:color w:val="FFFFFF"/>
+                <w:sz w:val="17"/>
+              </w:rPr>
               <w:t>Reading</w:t>
             </w:r>
           </w:p>
@@ -6928,59 +7316,85 @@
       <w:tr>
         <w:tc>
           <w:tcPr>
-            <w:tcW w:type="dxa" w:w="1928"/>
-          </w:tcPr>
-          <w:p>
-            <w:r/>
-            <w:r>
-              <w:rPr>
-                <w:sz w:val="17"/>
-              </w:rPr>
-            </w:r>
-          </w:p>
-        </w:tc>
-        <w:tc>
-          <w:tcPr>
-            <w:tcW w:type="dxa" w:w="1928"/>
-          </w:tcPr>
-          <w:p>
-            <w:r/>
-            <w:r>
-              <w:rPr>
-                <w:sz w:val="17"/>
-              </w:rPr>
-            </w:r>
-          </w:p>
-        </w:tc>
-        <w:tc>
-          <w:tcPr>
-            <w:tcW w:type="dxa" w:w="1928"/>
-          </w:tcPr>
-          <w:p>
-            <w:r/>
-            <w:r>
-              <w:rPr>
-                <w:sz w:val="17"/>
-              </w:rPr>
-            </w:r>
-          </w:p>
-        </w:tc>
-        <w:tc>
-          <w:tcPr>
-            <w:tcW w:type="dxa" w:w="1928"/>
-          </w:tcPr>
-          <w:p>
-            <w:r/>
-            <w:r>
-              <w:rPr>
-                <w:sz w:val="17"/>
-              </w:rPr>
-            </w:r>
-          </w:p>
-        </w:tc>
-        <w:tc>
-          <w:tcPr>
-            <w:tcW w:type="dxa" w:w="1928"/>
+            <w:tcW w:type="dxa" w:w="1377"/>
+          </w:tcPr>
+          <w:p>
+            <w:r/>
+            <w:r>
+              <w:rPr>
+                <w:sz w:val="17"/>
+              </w:rPr>
+            </w:r>
+          </w:p>
+        </w:tc>
+        <w:tc>
+          <w:tcPr>
+            <w:tcW w:type="dxa" w:w="1377"/>
+          </w:tcPr>
+          <w:p>
+            <w:r/>
+            <w:r>
+              <w:rPr>
+                <w:sz w:val="17"/>
+              </w:rPr>
+            </w:r>
+          </w:p>
+        </w:tc>
+        <w:tc>
+          <w:tcPr>
+            <w:tcW w:type="dxa" w:w="1377"/>
+          </w:tcPr>
+          <w:p>
+            <w:r/>
+            <w:r>
+              <w:rPr>
+                <w:sz w:val="17"/>
+              </w:rPr>
+            </w:r>
+          </w:p>
+        </w:tc>
+        <w:tc>
+          <w:tcPr>
+            <w:tcW w:type="dxa" w:w="1377"/>
+          </w:tcPr>
+          <w:p>
+            <w:r/>
+            <w:r>
+              <w:rPr>
+                <w:sz w:val="17"/>
+              </w:rPr>
+            </w:r>
+          </w:p>
+        </w:tc>
+        <w:tc>
+          <w:tcPr>
+            <w:tcW w:type="dxa" w:w="1377"/>
+          </w:tcPr>
+          <w:p>
+            <w:r/>
+            <w:r>
+              <w:rPr>
+                <w:sz w:val="17"/>
+              </w:rPr>
+            </w:r>
+          </w:p>
+        </w:tc>
+        <w:tc>
+          <w:tcPr>
+            <w:tcW w:type="dxa" w:w="1377"/>
+          </w:tcPr>
+          <w:p>
+            <w:r/>
+            <w:r>
+              <w:rPr>
+                <w:sz w:val="17"/>
+              </w:rPr>
+            </w:r>
+          </w:p>
+        </w:tc>
+        <w:tc>
+          <w:tcPr>
+            <w:tcW w:type="dxa" w:w="1377"/>
           </w:tcPr>
           <w:p>
             <w:r/>
@@ -6995,59 +7409,85 @@
       <w:tr>
         <w:tc>
           <w:tcPr>
-            <w:tcW w:type="dxa" w:w="1928"/>
-          </w:tcPr>
-          <w:p>
-            <w:r/>
-            <w:r>
-              <w:rPr>
-                <w:sz w:val="17"/>
-              </w:rPr>
-            </w:r>
-          </w:p>
-        </w:tc>
-        <w:tc>
-          <w:tcPr>
-            <w:tcW w:type="dxa" w:w="1928"/>
-          </w:tcPr>
-          <w:p>
-            <w:r/>
-            <w:r>
-              <w:rPr>
-                <w:sz w:val="17"/>
-              </w:rPr>
-            </w:r>
-          </w:p>
-        </w:tc>
-        <w:tc>
-          <w:tcPr>
-            <w:tcW w:type="dxa" w:w="1928"/>
-          </w:tcPr>
-          <w:p>
-            <w:r/>
-            <w:r>
-              <w:rPr>
-                <w:sz w:val="17"/>
-              </w:rPr>
-            </w:r>
-          </w:p>
-        </w:tc>
-        <w:tc>
-          <w:tcPr>
-            <w:tcW w:type="dxa" w:w="1928"/>
-          </w:tcPr>
-          <w:p>
-            <w:r/>
-            <w:r>
-              <w:rPr>
-                <w:sz w:val="17"/>
-              </w:rPr>
-            </w:r>
-          </w:p>
-        </w:tc>
-        <w:tc>
-          <w:tcPr>
-            <w:tcW w:type="dxa" w:w="1928"/>
+            <w:tcW w:type="dxa" w:w="1377"/>
+          </w:tcPr>
+          <w:p>
+            <w:r/>
+            <w:r>
+              <w:rPr>
+                <w:sz w:val="17"/>
+              </w:rPr>
+            </w:r>
+          </w:p>
+        </w:tc>
+        <w:tc>
+          <w:tcPr>
+            <w:tcW w:type="dxa" w:w="1377"/>
+          </w:tcPr>
+          <w:p>
+            <w:r/>
+            <w:r>
+              <w:rPr>
+                <w:sz w:val="17"/>
+              </w:rPr>
+            </w:r>
+          </w:p>
+        </w:tc>
+        <w:tc>
+          <w:tcPr>
+            <w:tcW w:type="dxa" w:w="1377"/>
+          </w:tcPr>
+          <w:p>
+            <w:r/>
+            <w:r>
+              <w:rPr>
+                <w:sz w:val="17"/>
+              </w:rPr>
+            </w:r>
+          </w:p>
+        </w:tc>
+        <w:tc>
+          <w:tcPr>
+            <w:tcW w:type="dxa" w:w="1377"/>
+          </w:tcPr>
+          <w:p>
+            <w:r/>
+            <w:r>
+              <w:rPr>
+                <w:sz w:val="17"/>
+              </w:rPr>
+            </w:r>
+          </w:p>
+        </w:tc>
+        <w:tc>
+          <w:tcPr>
+            <w:tcW w:type="dxa" w:w="1377"/>
+          </w:tcPr>
+          <w:p>
+            <w:r/>
+            <w:r>
+              <w:rPr>
+                <w:sz w:val="17"/>
+              </w:rPr>
+            </w:r>
+          </w:p>
+        </w:tc>
+        <w:tc>
+          <w:tcPr>
+            <w:tcW w:type="dxa" w:w="1377"/>
+          </w:tcPr>
+          <w:p>
+            <w:r/>
+            <w:r>
+              <w:rPr>
+                <w:sz w:val="17"/>
+              </w:rPr>
+            </w:r>
+          </w:p>
+        </w:tc>
+        <w:tc>
+          <w:tcPr>
+            <w:tcW w:type="dxa" w:w="1377"/>
           </w:tcPr>
           <w:p>
             <w:r/>
@@ -7062,59 +7502,85 @@
       <w:tr>
         <w:tc>
           <w:tcPr>
-            <w:tcW w:type="dxa" w:w="1928"/>
-          </w:tcPr>
-          <w:p>
-            <w:r/>
-            <w:r>
-              <w:rPr>
-                <w:sz w:val="17"/>
-              </w:rPr>
-            </w:r>
-          </w:p>
-        </w:tc>
-        <w:tc>
-          <w:tcPr>
-            <w:tcW w:type="dxa" w:w="1928"/>
-          </w:tcPr>
-          <w:p>
-            <w:r/>
-            <w:r>
-              <w:rPr>
-                <w:sz w:val="17"/>
-              </w:rPr>
-            </w:r>
-          </w:p>
-        </w:tc>
-        <w:tc>
-          <w:tcPr>
-            <w:tcW w:type="dxa" w:w="1928"/>
-          </w:tcPr>
-          <w:p>
-            <w:r/>
-            <w:r>
-              <w:rPr>
-                <w:sz w:val="17"/>
-              </w:rPr>
-            </w:r>
-          </w:p>
-        </w:tc>
-        <w:tc>
-          <w:tcPr>
-            <w:tcW w:type="dxa" w:w="1928"/>
-          </w:tcPr>
-          <w:p>
-            <w:r/>
-            <w:r>
-              <w:rPr>
-                <w:sz w:val="17"/>
-              </w:rPr>
-            </w:r>
-          </w:p>
-        </w:tc>
-        <w:tc>
-          <w:tcPr>
-            <w:tcW w:type="dxa" w:w="1928"/>
+            <w:tcW w:type="dxa" w:w="1377"/>
+          </w:tcPr>
+          <w:p>
+            <w:r/>
+            <w:r>
+              <w:rPr>
+                <w:sz w:val="17"/>
+              </w:rPr>
+            </w:r>
+          </w:p>
+        </w:tc>
+        <w:tc>
+          <w:tcPr>
+            <w:tcW w:type="dxa" w:w="1377"/>
+          </w:tcPr>
+          <w:p>
+            <w:r/>
+            <w:r>
+              <w:rPr>
+                <w:sz w:val="17"/>
+              </w:rPr>
+            </w:r>
+          </w:p>
+        </w:tc>
+        <w:tc>
+          <w:tcPr>
+            <w:tcW w:type="dxa" w:w="1377"/>
+          </w:tcPr>
+          <w:p>
+            <w:r/>
+            <w:r>
+              <w:rPr>
+                <w:sz w:val="17"/>
+              </w:rPr>
+            </w:r>
+          </w:p>
+        </w:tc>
+        <w:tc>
+          <w:tcPr>
+            <w:tcW w:type="dxa" w:w="1377"/>
+          </w:tcPr>
+          <w:p>
+            <w:r/>
+            <w:r>
+              <w:rPr>
+                <w:sz w:val="17"/>
+              </w:rPr>
+            </w:r>
+          </w:p>
+        </w:tc>
+        <w:tc>
+          <w:tcPr>
+            <w:tcW w:type="dxa" w:w="1377"/>
+          </w:tcPr>
+          <w:p>
+            <w:r/>
+            <w:r>
+              <w:rPr>
+                <w:sz w:val="17"/>
+              </w:rPr>
+            </w:r>
+          </w:p>
+        </w:tc>
+        <w:tc>
+          <w:tcPr>
+            <w:tcW w:type="dxa" w:w="1377"/>
+          </w:tcPr>
+          <w:p>
+            <w:r/>
+            <w:r>
+              <w:rPr>
+                <w:sz w:val="17"/>
+              </w:rPr>
+            </w:r>
+          </w:p>
+        </w:tc>
+        <w:tc>
+          <w:tcPr>
+            <w:tcW w:type="dxa" w:w="1377"/>
           </w:tcPr>
           <w:p>
             <w:r/>
@@ -7129,59 +7595,85 @@
       <w:tr>
         <w:tc>
           <w:tcPr>
-            <w:tcW w:type="dxa" w:w="1928"/>
-          </w:tcPr>
-          <w:p>
-            <w:r/>
-            <w:r>
-              <w:rPr>
-                <w:sz w:val="17"/>
-              </w:rPr>
-            </w:r>
-          </w:p>
-        </w:tc>
-        <w:tc>
-          <w:tcPr>
-            <w:tcW w:type="dxa" w:w="1928"/>
-          </w:tcPr>
-          <w:p>
-            <w:r/>
-            <w:r>
-              <w:rPr>
-                <w:sz w:val="17"/>
-              </w:rPr>
-            </w:r>
-          </w:p>
-        </w:tc>
-        <w:tc>
-          <w:tcPr>
-            <w:tcW w:type="dxa" w:w="1928"/>
-          </w:tcPr>
-          <w:p>
-            <w:r/>
-            <w:r>
-              <w:rPr>
-                <w:sz w:val="17"/>
-              </w:rPr>
-            </w:r>
-          </w:p>
-        </w:tc>
-        <w:tc>
-          <w:tcPr>
-            <w:tcW w:type="dxa" w:w="1928"/>
-          </w:tcPr>
-          <w:p>
-            <w:r/>
-            <w:r>
-              <w:rPr>
-                <w:sz w:val="17"/>
-              </w:rPr>
-            </w:r>
-          </w:p>
-        </w:tc>
-        <w:tc>
-          <w:tcPr>
-            <w:tcW w:type="dxa" w:w="1928"/>
+            <w:tcW w:type="dxa" w:w="1377"/>
+          </w:tcPr>
+          <w:p>
+            <w:r/>
+            <w:r>
+              <w:rPr>
+                <w:sz w:val="17"/>
+              </w:rPr>
+            </w:r>
+          </w:p>
+        </w:tc>
+        <w:tc>
+          <w:tcPr>
+            <w:tcW w:type="dxa" w:w="1377"/>
+          </w:tcPr>
+          <w:p>
+            <w:r/>
+            <w:r>
+              <w:rPr>
+                <w:sz w:val="17"/>
+              </w:rPr>
+            </w:r>
+          </w:p>
+        </w:tc>
+        <w:tc>
+          <w:tcPr>
+            <w:tcW w:type="dxa" w:w="1377"/>
+          </w:tcPr>
+          <w:p>
+            <w:r/>
+            <w:r>
+              <w:rPr>
+                <w:sz w:val="17"/>
+              </w:rPr>
+            </w:r>
+          </w:p>
+        </w:tc>
+        <w:tc>
+          <w:tcPr>
+            <w:tcW w:type="dxa" w:w="1377"/>
+          </w:tcPr>
+          <w:p>
+            <w:r/>
+            <w:r>
+              <w:rPr>
+                <w:sz w:val="17"/>
+              </w:rPr>
+            </w:r>
+          </w:p>
+        </w:tc>
+        <w:tc>
+          <w:tcPr>
+            <w:tcW w:type="dxa" w:w="1377"/>
+          </w:tcPr>
+          <w:p>
+            <w:r/>
+            <w:r>
+              <w:rPr>
+                <w:sz w:val="17"/>
+              </w:rPr>
+            </w:r>
+          </w:p>
+        </w:tc>
+        <w:tc>
+          <w:tcPr>
+            <w:tcW w:type="dxa" w:w="1377"/>
+          </w:tcPr>
+          <w:p>
+            <w:r/>
+            <w:r>
+              <w:rPr>
+                <w:sz w:val="17"/>
+              </w:rPr>
+            </w:r>
+          </w:p>
+        </w:tc>
+        <w:tc>
+          <w:tcPr>
+            <w:tcW w:type="dxa" w:w="1377"/>
           </w:tcPr>
           <w:p>
             <w:r/>
@@ -7674,7 +8166,7 @@
           <w:color w:val="666666"/>
           <w:sz w:val="18"/>
         </w:rPr>
-        <w:t>Translate every unmet gate into a condition precedent, a covenant or an accepted risk. Copy open items from the diligence checklist (Template T02).</w:t>
+        <w:t>Report the workbook's decision as the Investment_Readiness sheet computes it, on evidence only: STOP when a test fails (master check, covenant breach, negative contribution); GO when all 23 gates are met; CONDITIONAL GO when all 13 critical gates are met; otherwise STOP, evidence incomplete. A manual gate counts only when the sheet records where the evidence is held and who signed it off. The decision measures whether the evidence is complete; the recommendation in section 1 is the deal team's judgement. Where the two differ, say why, and write the conditions so that disbursement waits until the critical gates they address are evidenced.</w:t>
       </w:r>
     </w:p>
     <w:tbl>
@@ -7685,10 +8177,11 @@
         <w:tblLook w:firstColumn="1" w:firstRow="1" w:lastColumn="0" w:lastRow="0" w:noHBand="0" w:noVBand="1" w:val="04A0"/>
       </w:tblPr>
       <w:tblGrid>
-        <w:gridCol w:w="2409"/>
-        <w:gridCol w:w="2409"/>
-        <w:gridCol w:w="2409"/>
-        <w:gridCol w:w="2409"/>
+        <w:gridCol w:w="1928"/>
+        <w:gridCol w:w="1928"/>
+        <w:gridCol w:w="1928"/>
+        <w:gridCol w:w="1928"/>
+        <w:gridCol w:w="1928"/>
       </w:tblGrid>
       <w:tr>
         <w:trPr>
@@ -7696,7 +8189,7 @@
         </w:trPr>
         <w:tc>
           <w:tcPr>
-            <w:tcW w:type="dxa" w:w="2409"/>
+            <w:tcW w:type="dxa" w:w="1928"/>
             <w:shd w:val="clear" w:color="auto" w:fill="0B3020"/>
           </w:tcPr>
           <w:p>
@@ -7705,15 +8198,15 @@
               <w:rPr>
                 <w:b/>
                 <w:color w:val="FFFFFF"/>
-                <w:sz w:val="18"/>
-              </w:rPr>
-              <w:t>Gate or diligence item</w:t>
-            </w:r>
-          </w:p>
-        </w:tc>
-        <w:tc>
-          <w:tcPr>
-            <w:tcW w:type="dxa" w:w="2409"/>
+                <w:sz w:val="17"/>
+              </w:rPr>
+              <w:t>Gates met (of 23)</w:t>
+            </w:r>
+          </w:p>
+        </w:tc>
+        <w:tc>
+          <w:tcPr>
+            <w:tcW w:type="dxa" w:w="1928"/>
             <w:shd w:val="clear" w:color="auto" w:fill="0B3020"/>
           </w:tcPr>
           <w:p>
@@ -7722,15 +8215,15 @@
               <w:rPr>
                 <w:b/>
                 <w:color w:val="FFFFFF"/>
-                <w:sz w:val="18"/>
-              </w:rPr>
-              <w:t>Status</w:t>
-            </w:r>
-          </w:p>
-        </w:tc>
-        <w:tc>
-          <w:tcPr>
-            <w:tcW w:type="dxa" w:w="2409"/>
+                <w:sz w:val="17"/>
+              </w:rPr>
+              <w:t>Critical gates met (of 13)</w:t>
+            </w:r>
+          </w:p>
+        </w:tc>
+        <w:tc>
+          <w:tcPr>
+            <w:tcW w:type="dxa" w:w="1928"/>
             <w:shd w:val="clear" w:color="auto" w:fill="0B3020"/>
           </w:tcPr>
           <w:p>
@@ -7739,15 +8232,15 @@
               <w:rPr>
                 <w:b/>
                 <w:color w:val="FFFFFF"/>
-                <w:sz w:val="18"/>
-              </w:rPr>
-              <w:t>Evidence</w:t>
-            </w:r>
-          </w:p>
-        </w:tc>
-        <w:tc>
-          <w:tcPr>
-            <w:tcW w:type="dxa" w:w="2409"/>
+                <w:sz w:val="17"/>
+              </w:rPr>
+              <w:t>Failed tests</w:t>
+            </w:r>
+          </w:p>
+        </w:tc>
+        <w:tc>
+          <w:tcPr>
+            <w:tcW w:type="dxa" w:w="1928"/>
             <w:shd w:val="clear" w:color="auto" w:fill="0B3020"/>
           </w:tcPr>
           <w:p>
@@ -7756,9 +8249,26 @@
               <w:rPr>
                 <w:b/>
                 <w:color w:val="FFFFFF"/>
-                <w:sz w:val="18"/>
-              </w:rPr>
-              <w:t>Treatment</w:t>
+                <w:sz w:val="17"/>
+              </w:rPr>
+              <w:t>Workbook decision</w:t>
+            </w:r>
+          </w:p>
+        </w:tc>
+        <w:tc>
+          <w:tcPr>
+            <w:tcW w:type="dxa" w:w="1928"/>
+            <w:shd w:val="clear" w:color="auto" w:fill="0B3020"/>
+          </w:tcPr>
+          <w:p>
+            <w:r/>
+            <w:r>
+              <w:rPr>
+                <w:b/>
+                <w:color w:val="FFFFFF"/>
+                <w:sz w:val="17"/>
+              </w:rPr>
+              <w:t>Deal team recommendation</w:t>
             </w:r>
           </w:p>
         </w:tc>
@@ -7766,53 +8276,200 @@
       <w:tr>
         <w:tc>
           <w:tcPr>
-            <w:tcW w:type="dxa" w:w="2409"/>
-          </w:tcPr>
-          <w:p>
-            <w:r/>
-            <w:r>
-              <w:rPr>
-                <w:sz w:val="18"/>
-              </w:rPr>
-            </w:r>
-          </w:p>
-        </w:tc>
-        <w:tc>
-          <w:tcPr>
-            <w:tcW w:type="dxa" w:w="2409"/>
-          </w:tcPr>
-          <w:p>
-            <w:r/>
-            <w:r>
-              <w:rPr>
-                <w:sz w:val="18"/>
-              </w:rPr>
-            </w:r>
-          </w:p>
-        </w:tc>
-        <w:tc>
-          <w:tcPr>
-            <w:tcW w:type="dxa" w:w="2409"/>
-          </w:tcPr>
-          <w:p>
-            <w:r/>
-            <w:r>
-              <w:rPr>
-                <w:sz w:val="18"/>
-              </w:rPr>
-            </w:r>
-          </w:p>
-        </w:tc>
-        <w:tc>
-          <w:tcPr>
-            <w:tcW w:type="dxa" w:w="2409"/>
-          </w:tcPr>
-          <w:p>
-            <w:r/>
-            <w:r>
-              <w:rPr>
-                <w:sz w:val="18"/>
-              </w:rPr>
+            <w:tcW w:type="dxa" w:w="1928"/>
+          </w:tcPr>
+          <w:p>
+            <w:r/>
+            <w:r>
+              <w:rPr>
+                <w:sz w:val="17"/>
+              </w:rPr>
+            </w:r>
+          </w:p>
+        </w:tc>
+        <w:tc>
+          <w:tcPr>
+            <w:tcW w:type="dxa" w:w="1928"/>
+          </w:tcPr>
+          <w:p>
+            <w:r/>
+            <w:r>
+              <w:rPr>
+                <w:sz w:val="17"/>
+              </w:rPr>
+            </w:r>
+          </w:p>
+        </w:tc>
+        <w:tc>
+          <w:tcPr>
+            <w:tcW w:type="dxa" w:w="1928"/>
+          </w:tcPr>
+          <w:p>
+            <w:r/>
+            <w:r>
+              <w:rPr>
+                <w:sz w:val="17"/>
+              </w:rPr>
+            </w:r>
+          </w:p>
+        </w:tc>
+        <w:tc>
+          <w:tcPr>
+            <w:tcW w:type="dxa" w:w="1928"/>
+          </w:tcPr>
+          <w:p>
+            <w:r/>
+            <w:r>
+              <w:rPr>
+                <w:sz w:val="17"/>
+              </w:rPr>
+            </w:r>
+          </w:p>
+        </w:tc>
+        <w:tc>
+          <w:tcPr>
+            <w:tcW w:type="dxa" w:w="1928"/>
+          </w:tcPr>
+          <w:p>
+            <w:r/>
+            <w:r>
+              <w:rPr>
+                <w:sz w:val="17"/>
+              </w:rPr>
+            </w:r>
+          </w:p>
+        </w:tc>
+      </w:tr>
+    </w:tbl>
+    <w:p/>
+    <w:p>
+      <w:r>
+        <w:rPr>
+          <w:i/>
+          <w:color w:val="666666"/>
+          <w:sz w:val="18"/>
+        </w:rPr>
+        <w:t>Translate every open gate into a condition precedent, a covenant or an accepted risk. Copy open items from the diligence checklist (Template T02).</w:t>
+      </w:r>
+    </w:p>
+    <w:tbl>
+      <w:tblPr>
+        <w:tblStyle w:val="TableGrid"/>
+        <w:tblW w:type="auto" w:w="0"/>
+        <w:jc w:val="center"/>
+        <w:tblLook w:firstColumn="1" w:firstRow="1" w:lastColumn="0" w:lastRow="0" w:noHBand="0" w:noVBand="1" w:val="04A0"/>
+      </w:tblPr>
+      <w:tblGrid>
+        <w:gridCol w:w="1606"/>
+        <w:gridCol w:w="1606"/>
+        <w:gridCol w:w="1606"/>
+        <w:gridCol w:w="1606"/>
+        <w:gridCol w:w="1606"/>
+        <w:gridCol w:w="1606"/>
+      </w:tblGrid>
+      <w:tr>
+        <w:trPr>
+          <w:tblHeader w:val="true"/>
+        </w:trPr>
+        <w:tc>
+          <w:tcPr>
+            <w:tcW w:type="dxa" w:w="1606"/>
+            <w:shd w:val="clear" w:color="auto" w:fill="0B3020"/>
+          </w:tcPr>
+          <w:p>
+            <w:r/>
+            <w:r>
+              <w:rPr>
+                <w:b/>
+                <w:color w:val="FFFFFF"/>
+                <w:sz w:val="17"/>
+              </w:rPr>
+              <w:t>Gate or diligence item</w:t>
+            </w:r>
+          </w:p>
+        </w:tc>
+        <w:tc>
+          <w:tcPr>
+            <w:tcW w:type="dxa" w:w="1606"/>
+            <w:shd w:val="clear" w:color="auto" w:fill="0B3020"/>
+          </w:tcPr>
+          <w:p>
+            <w:r/>
+            <w:r>
+              <w:rPr>
+                <w:b/>
+                <w:color w:val="FFFFFF"/>
+                <w:sz w:val="17"/>
+              </w:rPr>
+              <w:t>Critical</w:t>
+            </w:r>
+          </w:p>
+        </w:tc>
+        <w:tc>
+          <w:tcPr>
+            <w:tcW w:type="dxa" w:w="1606"/>
+            <w:shd w:val="clear" w:color="auto" w:fill="0B3020"/>
+          </w:tcPr>
+          <w:p>
+            <w:r/>
+            <w:r>
+              <w:rPr>
+                <w:b/>
+                <w:color w:val="FFFFFF"/>
+                <w:sz w:val="17"/>
+              </w:rPr>
+              <w:t>Status</w:t>
+            </w:r>
+          </w:p>
+        </w:tc>
+        <w:tc>
+          <w:tcPr>
+            <w:tcW w:type="dxa" w:w="1606"/>
+            <w:shd w:val="clear" w:color="auto" w:fill="0B3020"/>
+          </w:tcPr>
+          <w:p>
+            <w:r/>
+            <w:r>
+              <w:rPr>
+                <w:b/>
+                <w:color w:val="FFFFFF"/>
+                <w:sz w:val="17"/>
+              </w:rPr>
+              <w:t>Evidence held at</w:t>
+            </w:r>
+          </w:p>
+        </w:tc>
+        <w:tc>
+          <w:tcPr>
+            <w:tcW w:type="dxa" w:w="1606"/>
+            <w:shd w:val="clear" w:color="auto" w:fill="0B3020"/>
+          </w:tcPr>
+          <w:p>
+            <w:r/>
+            <w:r>
+              <w:rPr>
+                <w:b/>
+                <w:color w:val="FFFFFF"/>
+                <w:sz w:val="17"/>
+              </w:rPr>
+              <w:t>Signed off by</w:t>
+            </w:r>
+          </w:p>
+        </w:tc>
+        <w:tc>
+          <w:tcPr>
+            <w:tcW w:type="dxa" w:w="1606"/>
+            <w:shd w:val="clear" w:color="auto" w:fill="0B3020"/>
+          </w:tcPr>
+          <w:p>
+            <w:r/>
+            <w:r>
+              <w:rPr>
+                <w:b/>
+                <w:color w:val="FFFFFF"/>
+                <w:sz w:val="17"/>
+              </w:rPr>
+              <w:t>Treatment</w:t>
             </w:r>
           </w:p>
         </w:tc>
@@ -7820,52 +8477,78 @@
       <w:tr>
         <w:tc>
           <w:tcPr>
-            <w:tcW w:type="dxa" w:w="2409"/>
-          </w:tcPr>
-          <w:p>
-            <w:r/>
-            <w:r>
-              <w:rPr>
-                <w:sz w:val="18"/>
-              </w:rPr>
-            </w:r>
-          </w:p>
-        </w:tc>
-        <w:tc>
-          <w:tcPr>
-            <w:tcW w:type="dxa" w:w="2409"/>
-          </w:tcPr>
-          <w:p>
-            <w:r/>
-            <w:r>
-              <w:rPr>
-                <w:sz w:val="18"/>
-              </w:rPr>
-            </w:r>
-          </w:p>
-        </w:tc>
-        <w:tc>
-          <w:tcPr>
-            <w:tcW w:type="dxa" w:w="2409"/>
-          </w:tcPr>
-          <w:p>
-            <w:r/>
-            <w:r>
-              <w:rPr>
-                <w:sz w:val="18"/>
-              </w:rPr>
-            </w:r>
-          </w:p>
-        </w:tc>
-        <w:tc>
-          <w:tcPr>
-            <w:tcW w:type="dxa" w:w="2409"/>
-          </w:tcPr>
-          <w:p>
-            <w:r/>
-            <w:r>
-              <w:rPr>
-                <w:sz w:val="18"/>
+            <w:tcW w:type="dxa" w:w="1606"/>
+          </w:tcPr>
+          <w:p>
+            <w:r/>
+            <w:r>
+              <w:rPr>
+                <w:sz w:val="17"/>
+              </w:rPr>
+            </w:r>
+          </w:p>
+        </w:tc>
+        <w:tc>
+          <w:tcPr>
+            <w:tcW w:type="dxa" w:w="1606"/>
+          </w:tcPr>
+          <w:p>
+            <w:r/>
+            <w:r>
+              <w:rPr>
+                <w:sz w:val="17"/>
+              </w:rPr>
+            </w:r>
+          </w:p>
+        </w:tc>
+        <w:tc>
+          <w:tcPr>
+            <w:tcW w:type="dxa" w:w="1606"/>
+          </w:tcPr>
+          <w:p>
+            <w:r/>
+            <w:r>
+              <w:rPr>
+                <w:sz w:val="17"/>
+              </w:rPr>
+            </w:r>
+          </w:p>
+        </w:tc>
+        <w:tc>
+          <w:tcPr>
+            <w:tcW w:type="dxa" w:w="1606"/>
+          </w:tcPr>
+          <w:p>
+            <w:r/>
+            <w:r>
+              <w:rPr>
+                <w:sz w:val="17"/>
+              </w:rPr>
+            </w:r>
+          </w:p>
+        </w:tc>
+        <w:tc>
+          <w:tcPr>
+            <w:tcW w:type="dxa" w:w="1606"/>
+          </w:tcPr>
+          <w:p>
+            <w:r/>
+            <w:r>
+              <w:rPr>
+                <w:sz w:val="17"/>
+              </w:rPr>
+            </w:r>
+          </w:p>
+        </w:tc>
+        <w:tc>
+          <w:tcPr>
+            <w:tcW w:type="dxa" w:w="1606"/>
+          </w:tcPr>
+          <w:p>
+            <w:r/>
+            <w:r>
+              <w:rPr>
+                <w:sz w:val="17"/>
               </w:rPr>
             </w:r>
           </w:p>
@@ -7874,52 +8557,78 @@
       <w:tr>
         <w:tc>
           <w:tcPr>
-            <w:tcW w:type="dxa" w:w="2409"/>
-          </w:tcPr>
-          <w:p>
-            <w:r/>
-            <w:r>
-              <w:rPr>
-                <w:sz w:val="18"/>
-              </w:rPr>
-            </w:r>
-          </w:p>
-        </w:tc>
-        <w:tc>
-          <w:tcPr>
-            <w:tcW w:type="dxa" w:w="2409"/>
-          </w:tcPr>
-          <w:p>
-            <w:r/>
-            <w:r>
-              <w:rPr>
-                <w:sz w:val="18"/>
-              </w:rPr>
-            </w:r>
-          </w:p>
-        </w:tc>
-        <w:tc>
-          <w:tcPr>
-            <w:tcW w:type="dxa" w:w="2409"/>
-          </w:tcPr>
-          <w:p>
-            <w:r/>
-            <w:r>
-              <w:rPr>
-                <w:sz w:val="18"/>
-              </w:rPr>
-            </w:r>
-          </w:p>
-        </w:tc>
-        <w:tc>
-          <w:tcPr>
-            <w:tcW w:type="dxa" w:w="2409"/>
-          </w:tcPr>
-          <w:p>
-            <w:r/>
-            <w:r>
-              <w:rPr>
-                <w:sz w:val="18"/>
+            <w:tcW w:type="dxa" w:w="1606"/>
+          </w:tcPr>
+          <w:p>
+            <w:r/>
+            <w:r>
+              <w:rPr>
+                <w:sz w:val="17"/>
+              </w:rPr>
+            </w:r>
+          </w:p>
+        </w:tc>
+        <w:tc>
+          <w:tcPr>
+            <w:tcW w:type="dxa" w:w="1606"/>
+          </w:tcPr>
+          <w:p>
+            <w:r/>
+            <w:r>
+              <w:rPr>
+                <w:sz w:val="17"/>
+              </w:rPr>
+            </w:r>
+          </w:p>
+        </w:tc>
+        <w:tc>
+          <w:tcPr>
+            <w:tcW w:type="dxa" w:w="1606"/>
+          </w:tcPr>
+          <w:p>
+            <w:r/>
+            <w:r>
+              <w:rPr>
+                <w:sz w:val="17"/>
+              </w:rPr>
+            </w:r>
+          </w:p>
+        </w:tc>
+        <w:tc>
+          <w:tcPr>
+            <w:tcW w:type="dxa" w:w="1606"/>
+          </w:tcPr>
+          <w:p>
+            <w:r/>
+            <w:r>
+              <w:rPr>
+                <w:sz w:val="17"/>
+              </w:rPr>
+            </w:r>
+          </w:p>
+        </w:tc>
+        <w:tc>
+          <w:tcPr>
+            <w:tcW w:type="dxa" w:w="1606"/>
+          </w:tcPr>
+          <w:p>
+            <w:r/>
+            <w:r>
+              <w:rPr>
+                <w:sz w:val="17"/>
+              </w:rPr>
+            </w:r>
+          </w:p>
+        </w:tc>
+        <w:tc>
+          <w:tcPr>
+            <w:tcW w:type="dxa" w:w="1606"/>
+          </w:tcPr>
+          <w:p>
+            <w:r/>
+            <w:r>
+              <w:rPr>
+                <w:sz w:val="17"/>
               </w:rPr>
             </w:r>
           </w:p>
@@ -7928,52 +8637,78 @@
       <w:tr>
         <w:tc>
           <w:tcPr>
-            <w:tcW w:type="dxa" w:w="2409"/>
-          </w:tcPr>
-          <w:p>
-            <w:r/>
-            <w:r>
-              <w:rPr>
-                <w:sz w:val="18"/>
-              </w:rPr>
-            </w:r>
-          </w:p>
-        </w:tc>
-        <w:tc>
-          <w:tcPr>
-            <w:tcW w:type="dxa" w:w="2409"/>
-          </w:tcPr>
-          <w:p>
-            <w:r/>
-            <w:r>
-              <w:rPr>
-                <w:sz w:val="18"/>
-              </w:rPr>
-            </w:r>
-          </w:p>
-        </w:tc>
-        <w:tc>
-          <w:tcPr>
-            <w:tcW w:type="dxa" w:w="2409"/>
-          </w:tcPr>
-          <w:p>
-            <w:r/>
-            <w:r>
-              <w:rPr>
-                <w:sz w:val="18"/>
-              </w:rPr>
-            </w:r>
-          </w:p>
-        </w:tc>
-        <w:tc>
-          <w:tcPr>
-            <w:tcW w:type="dxa" w:w="2409"/>
-          </w:tcPr>
-          <w:p>
-            <w:r/>
-            <w:r>
-              <w:rPr>
-                <w:sz w:val="18"/>
+            <w:tcW w:type="dxa" w:w="1606"/>
+          </w:tcPr>
+          <w:p>
+            <w:r/>
+            <w:r>
+              <w:rPr>
+                <w:sz w:val="17"/>
+              </w:rPr>
+            </w:r>
+          </w:p>
+        </w:tc>
+        <w:tc>
+          <w:tcPr>
+            <w:tcW w:type="dxa" w:w="1606"/>
+          </w:tcPr>
+          <w:p>
+            <w:r/>
+            <w:r>
+              <w:rPr>
+                <w:sz w:val="17"/>
+              </w:rPr>
+            </w:r>
+          </w:p>
+        </w:tc>
+        <w:tc>
+          <w:tcPr>
+            <w:tcW w:type="dxa" w:w="1606"/>
+          </w:tcPr>
+          <w:p>
+            <w:r/>
+            <w:r>
+              <w:rPr>
+                <w:sz w:val="17"/>
+              </w:rPr>
+            </w:r>
+          </w:p>
+        </w:tc>
+        <w:tc>
+          <w:tcPr>
+            <w:tcW w:type="dxa" w:w="1606"/>
+          </w:tcPr>
+          <w:p>
+            <w:r/>
+            <w:r>
+              <w:rPr>
+                <w:sz w:val="17"/>
+              </w:rPr>
+            </w:r>
+          </w:p>
+        </w:tc>
+        <w:tc>
+          <w:tcPr>
+            <w:tcW w:type="dxa" w:w="1606"/>
+          </w:tcPr>
+          <w:p>
+            <w:r/>
+            <w:r>
+              <w:rPr>
+                <w:sz w:val="17"/>
+              </w:rPr>
+            </w:r>
+          </w:p>
+        </w:tc>
+        <w:tc>
+          <w:tcPr>
+            <w:tcW w:type="dxa" w:w="1606"/>
+          </w:tcPr>
+          <w:p>
+            <w:r/>
+            <w:r>
+              <w:rPr>
+                <w:sz w:val="17"/>
               </w:rPr>
             </w:r>
           </w:p>
@@ -7982,52 +8717,78 @@
       <w:tr>
         <w:tc>
           <w:tcPr>
-            <w:tcW w:type="dxa" w:w="2409"/>
-          </w:tcPr>
-          <w:p>
-            <w:r/>
-            <w:r>
-              <w:rPr>
-                <w:sz w:val="18"/>
-              </w:rPr>
-            </w:r>
-          </w:p>
-        </w:tc>
-        <w:tc>
-          <w:tcPr>
-            <w:tcW w:type="dxa" w:w="2409"/>
-          </w:tcPr>
-          <w:p>
-            <w:r/>
-            <w:r>
-              <w:rPr>
-                <w:sz w:val="18"/>
-              </w:rPr>
-            </w:r>
-          </w:p>
-        </w:tc>
-        <w:tc>
-          <w:tcPr>
-            <w:tcW w:type="dxa" w:w="2409"/>
-          </w:tcPr>
-          <w:p>
-            <w:r/>
-            <w:r>
-              <w:rPr>
-                <w:sz w:val="18"/>
-              </w:rPr>
-            </w:r>
-          </w:p>
-        </w:tc>
-        <w:tc>
-          <w:tcPr>
-            <w:tcW w:type="dxa" w:w="2409"/>
-          </w:tcPr>
-          <w:p>
-            <w:r/>
-            <w:r>
-              <w:rPr>
-                <w:sz w:val="18"/>
+            <w:tcW w:type="dxa" w:w="1606"/>
+          </w:tcPr>
+          <w:p>
+            <w:r/>
+            <w:r>
+              <w:rPr>
+                <w:sz w:val="17"/>
+              </w:rPr>
+            </w:r>
+          </w:p>
+        </w:tc>
+        <w:tc>
+          <w:tcPr>
+            <w:tcW w:type="dxa" w:w="1606"/>
+          </w:tcPr>
+          <w:p>
+            <w:r/>
+            <w:r>
+              <w:rPr>
+                <w:sz w:val="17"/>
+              </w:rPr>
+            </w:r>
+          </w:p>
+        </w:tc>
+        <w:tc>
+          <w:tcPr>
+            <w:tcW w:type="dxa" w:w="1606"/>
+          </w:tcPr>
+          <w:p>
+            <w:r/>
+            <w:r>
+              <w:rPr>
+                <w:sz w:val="17"/>
+              </w:rPr>
+            </w:r>
+          </w:p>
+        </w:tc>
+        <w:tc>
+          <w:tcPr>
+            <w:tcW w:type="dxa" w:w="1606"/>
+          </w:tcPr>
+          <w:p>
+            <w:r/>
+            <w:r>
+              <w:rPr>
+                <w:sz w:val="17"/>
+              </w:rPr>
+            </w:r>
+          </w:p>
+        </w:tc>
+        <w:tc>
+          <w:tcPr>
+            <w:tcW w:type="dxa" w:w="1606"/>
+          </w:tcPr>
+          <w:p>
+            <w:r/>
+            <w:r>
+              <w:rPr>
+                <w:sz w:val="17"/>
+              </w:rPr>
+            </w:r>
+          </w:p>
+        </w:tc>
+        <w:tc>
+          <w:tcPr>
+            <w:tcW w:type="dxa" w:w="1606"/>
+          </w:tcPr>
+          <w:p>
+            <w:r/>
+            <w:r>
+              <w:rPr>
+                <w:sz w:val="17"/>
               </w:rPr>
             </w:r>
           </w:p>
@@ -8036,52 +8797,78 @@
       <w:tr>
         <w:tc>
           <w:tcPr>
-            <w:tcW w:type="dxa" w:w="2409"/>
-          </w:tcPr>
-          <w:p>
-            <w:r/>
-            <w:r>
-              <w:rPr>
-                <w:sz w:val="18"/>
-              </w:rPr>
-            </w:r>
-          </w:p>
-        </w:tc>
-        <w:tc>
-          <w:tcPr>
-            <w:tcW w:type="dxa" w:w="2409"/>
-          </w:tcPr>
-          <w:p>
-            <w:r/>
-            <w:r>
-              <w:rPr>
-                <w:sz w:val="18"/>
-              </w:rPr>
-            </w:r>
-          </w:p>
-        </w:tc>
-        <w:tc>
-          <w:tcPr>
-            <w:tcW w:type="dxa" w:w="2409"/>
-          </w:tcPr>
-          <w:p>
-            <w:r/>
-            <w:r>
-              <w:rPr>
-                <w:sz w:val="18"/>
-              </w:rPr>
-            </w:r>
-          </w:p>
-        </w:tc>
-        <w:tc>
-          <w:tcPr>
-            <w:tcW w:type="dxa" w:w="2409"/>
-          </w:tcPr>
-          <w:p>
-            <w:r/>
-            <w:r>
-              <w:rPr>
-                <w:sz w:val="18"/>
+            <w:tcW w:type="dxa" w:w="1606"/>
+          </w:tcPr>
+          <w:p>
+            <w:r/>
+            <w:r>
+              <w:rPr>
+                <w:sz w:val="17"/>
+              </w:rPr>
+            </w:r>
+          </w:p>
+        </w:tc>
+        <w:tc>
+          <w:tcPr>
+            <w:tcW w:type="dxa" w:w="1606"/>
+          </w:tcPr>
+          <w:p>
+            <w:r/>
+            <w:r>
+              <w:rPr>
+                <w:sz w:val="17"/>
+              </w:rPr>
+            </w:r>
+          </w:p>
+        </w:tc>
+        <w:tc>
+          <w:tcPr>
+            <w:tcW w:type="dxa" w:w="1606"/>
+          </w:tcPr>
+          <w:p>
+            <w:r/>
+            <w:r>
+              <w:rPr>
+                <w:sz w:val="17"/>
+              </w:rPr>
+            </w:r>
+          </w:p>
+        </w:tc>
+        <w:tc>
+          <w:tcPr>
+            <w:tcW w:type="dxa" w:w="1606"/>
+          </w:tcPr>
+          <w:p>
+            <w:r/>
+            <w:r>
+              <w:rPr>
+                <w:sz w:val="17"/>
+              </w:rPr>
+            </w:r>
+          </w:p>
+        </w:tc>
+        <w:tc>
+          <w:tcPr>
+            <w:tcW w:type="dxa" w:w="1606"/>
+          </w:tcPr>
+          <w:p>
+            <w:r/>
+            <w:r>
+              <w:rPr>
+                <w:sz w:val="17"/>
+              </w:rPr>
+            </w:r>
+          </w:p>
+        </w:tc>
+        <w:tc>
+          <w:tcPr>
+            <w:tcW w:type="dxa" w:w="1606"/>
+          </w:tcPr>
+          <w:p>
+            <w:r/>
+            <w:r>
+              <w:rPr>
+                <w:sz w:val="17"/>
               </w:rPr>
             </w:r>
           </w:p>
@@ -8090,52 +8877,78 @@
       <w:tr>
         <w:tc>
           <w:tcPr>
-            <w:tcW w:type="dxa" w:w="2409"/>
-          </w:tcPr>
-          <w:p>
-            <w:r/>
-            <w:r>
-              <w:rPr>
-                <w:sz w:val="18"/>
-              </w:rPr>
-            </w:r>
-          </w:p>
-        </w:tc>
-        <w:tc>
-          <w:tcPr>
-            <w:tcW w:type="dxa" w:w="2409"/>
-          </w:tcPr>
-          <w:p>
-            <w:r/>
-            <w:r>
-              <w:rPr>
-                <w:sz w:val="18"/>
-              </w:rPr>
-            </w:r>
-          </w:p>
-        </w:tc>
-        <w:tc>
-          <w:tcPr>
-            <w:tcW w:type="dxa" w:w="2409"/>
-          </w:tcPr>
-          <w:p>
-            <w:r/>
-            <w:r>
-              <w:rPr>
-                <w:sz w:val="18"/>
-              </w:rPr>
-            </w:r>
-          </w:p>
-        </w:tc>
-        <w:tc>
-          <w:tcPr>
-            <w:tcW w:type="dxa" w:w="2409"/>
-          </w:tcPr>
-          <w:p>
-            <w:r/>
-            <w:r>
-              <w:rPr>
-                <w:sz w:val="18"/>
+            <w:tcW w:type="dxa" w:w="1606"/>
+          </w:tcPr>
+          <w:p>
+            <w:r/>
+            <w:r>
+              <w:rPr>
+                <w:sz w:val="17"/>
+              </w:rPr>
+            </w:r>
+          </w:p>
+        </w:tc>
+        <w:tc>
+          <w:tcPr>
+            <w:tcW w:type="dxa" w:w="1606"/>
+          </w:tcPr>
+          <w:p>
+            <w:r/>
+            <w:r>
+              <w:rPr>
+                <w:sz w:val="17"/>
+              </w:rPr>
+            </w:r>
+          </w:p>
+        </w:tc>
+        <w:tc>
+          <w:tcPr>
+            <w:tcW w:type="dxa" w:w="1606"/>
+          </w:tcPr>
+          <w:p>
+            <w:r/>
+            <w:r>
+              <w:rPr>
+                <w:sz w:val="17"/>
+              </w:rPr>
+            </w:r>
+          </w:p>
+        </w:tc>
+        <w:tc>
+          <w:tcPr>
+            <w:tcW w:type="dxa" w:w="1606"/>
+          </w:tcPr>
+          <w:p>
+            <w:r/>
+            <w:r>
+              <w:rPr>
+                <w:sz w:val="17"/>
+              </w:rPr>
+            </w:r>
+          </w:p>
+        </w:tc>
+        <w:tc>
+          <w:tcPr>
+            <w:tcW w:type="dxa" w:w="1606"/>
+          </w:tcPr>
+          <w:p>
+            <w:r/>
+            <w:r>
+              <w:rPr>
+                <w:sz w:val="17"/>
+              </w:rPr>
+            </w:r>
+          </w:p>
+        </w:tc>
+        <w:tc>
+          <w:tcPr>
+            <w:tcW w:type="dxa" w:w="1606"/>
+          </w:tcPr>
+          <w:p>
+            <w:r/>
+            <w:r>
+              <w:rPr>
+                <w:sz w:val="17"/>
               </w:rPr>
             </w:r>
           </w:p>
@@ -8144,52 +8957,158 @@
       <w:tr>
         <w:tc>
           <w:tcPr>
-            <w:tcW w:type="dxa" w:w="2409"/>
-          </w:tcPr>
-          <w:p>
-            <w:r/>
-            <w:r>
-              <w:rPr>
-                <w:sz w:val="18"/>
-              </w:rPr>
-            </w:r>
-          </w:p>
-        </w:tc>
-        <w:tc>
-          <w:tcPr>
-            <w:tcW w:type="dxa" w:w="2409"/>
-          </w:tcPr>
-          <w:p>
-            <w:r/>
-            <w:r>
-              <w:rPr>
-                <w:sz w:val="18"/>
-              </w:rPr>
-            </w:r>
-          </w:p>
-        </w:tc>
-        <w:tc>
-          <w:tcPr>
-            <w:tcW w:type="dxa" w:w="2409"/>
-          </w:tcPr>
-          <w:p>
-            <w:r/>
-            <w:r>
-              <w:rPr>
-                <w:sz w:val="18"/>
-              </w:rPr>
-            </w:r>
-          </w:p>
-        </w:tc>
-        <w:tc>
-          <w:tcPr>
-            <w:tcW w:type="dxa" w:w="2409"/>
-          </w:tcPr>
-          <w:p>
-            <w:r/>
-            <w:r>
-              <w:rPr>
-                <w:sz w:val="18"/>
+            <w:tcW w:type="dxa" w:w="1606"/>
+          </w:tcPr>
+          <w:p>
+            <w:r/>
+            <w:r>
+              <w:rPr>
+                <w:sz w:val="17"/>
+              </w:rPr>
+            </w:r>
+          </w:p>
+        </w:tc>
+        <w:tc>
+          <w:tcPr>
+            <w:tcW w:type="dxa" w:w="1606"/>
+          </w:tcPr>
+          <w:p>
+            <w:r/>
+            <w:r>
+              <w:rPr>
+                <w:sz w:val="17"/>
+              </w:rPr>
+            </w:r>
+          </w:p>
+        </w:tc>
+        <w:tc>
+          <w:tcPr>
+            <w:tcW w:type="dxa" w:w="1606"/>
+          </w:tcPr>
+          <w:p>
+            <w:r/>
+            <w:r>
+              <w:rPr>
+                <w:sz w:val="17"/>
+              </w:rPr>
+            </w:r>
+          </w:p>
+        </w:tc>
+        <w:tc>
+          <w:tcPr>
+            <w:tcW w:type="dxa" w:w="1606"/>
+          </w:tcPr>
+          <w:p>
+            <w:r/>
+            <w:r>
+              <w:rPr>
+                <w:sz w:val="17"/>
+              </w:rPr>
+            </w:r>
+          </w:p>
+        </w:tc>
+        <w:tc>
+          <w:tcPr>
+            <w:tcW w:type="dxa" w:w="1606"/>
+          </w:tcPr>
+          <w:p>
+            <w:r/>
+            <w:r>
+              <w:rPr>
+                <w:sz w:val="17"/>
+              </w:rPr>
+            </w:r>
+          </w:p>
+        </w:tc>
+        <w:tc>
+          <w:tcPr>
+            <w:tcW w:type="dxa" w:w="1606"/>
+          </w:tcPr>
+          <w:p>
+            <w:r/>
+            <w:r>
+              <w:rPr>
+                <w:sz w:val="17"/>
+              </w:rPr>
+            </w:r>
+          </w:p>
+        </w:tc>
+      </w:tr>
+      <w:tr>
+        <w:tc>
+          <w:tcPr>
+            <w:tcW w:type="dxa" w:w="1606"/>
+          </w:tcPr>
+          <w:p>
+            <w:r/>
+            <w:r>
+              <w:rPr>
+                <w:sz w:val="17"/>
+              </w:rPr>
+            </w:r>
+          </w:p>
+        </w:tc>
+        <w:tc>
+          <w:tcPr>
+            <w:tcW w:type="dxa" w:w="1606"/>
+          </w:tcPr>
+          <w:p>
+            <w:r/>
+            <w:r>
+              <w:rPr>
+                <w:sz w:val="17"/>
+              </w:rPr>
+            </w:r>
+          </w:p>
+        </w:tc>
+        <w:tc>
+          <w:tcPr>
+            <w:tcW w:type="dxa" w:w="1606"/>
+          </w:tcPr>
+          <w:p>
+            <w:r/>
+            <w:r>
+              <w:rPr>
+                <w:sz w:val="17"/>
+              </w:rPr>
+            </w:r>
+          </w:p>
+        </w:tc>
+        <w:tc>
+          <w:tcPr>
+            <w:tcW w:type="dxa" w:w="1606"/>
+          </w:tcPr>
+          <w:p>
+            <w:r/>
+            <w:r>
+              <w:rPr>
+                <w:sz w:val="17"/>
+              </w:rPr>
+            </w:r>
+          </w:p>
+        </w:tc>
+        <w:tc>
+          <w:tcPr>
+            <w:tcW w:type="dxa" w:w="1606"/>
+          </w:tcPr>
+          <w:p>
+            <w:r/>
+            <w:r>
+              <w:rPr>
+                <w:sz w:val="17"/>
+              </w:rPr>
+            </w:r>
+          </w:p>
+        </w:tc>
+        <w:tc>
+          <w:tcPr>
+            <w:tcW w:type="dxa" w:w="1606"/>
+          </w:tcPr>
+          <w:p>
+            <w:r/>
+            <w:r>
+              <w:rPr>
+                <w:sz w:val="17"/>
               </w:rPr>
             </w:r>
           </w:p>
@@ -9132,7 +10051,7 @@
           <w:color w:val="666666"/>
           <w:sz w:val="18"/>
         </w:rPr>
-        <w:t>List every external figure quoted in the memo with its source and whether the primary document has been read.</w:t>
+        <w:t>List every external figure quoted in the memo with its source, the page read, its grade (A to D) and its status (VERIFIED, VERIFIED (HISTORICAL), PENDING PRIMARY DOCUMENT, UNVERIFIED, CONFLICTING SOURCES, NOT USED).</w:t>
       </w:r>
     </w:p>
     <w:tbl>
@@ -9143,10 +10062,11 @@
         <w:tblLook w:firstColumn="1" w:firstRow="1" w:lastColumn="0" w:lastRow="0" w:noHBand="0" w:noVBand="1" w:val="04A0"/>
       </w:tblPr>
       <w:tblGrid>
-        <w:gridCol w:w="2409"/>
-        <w:gridCol w:w="2409"/>
-        <w:gridCol w:w="2409"/>
-        <w:gridCol w:w="2409"/>
+        <w:gridCol w:w="1928"/>
+        <w:gridCol w:w="1928"/>
+        <w:gridCol w:w="1928"/>
+        <w:gridCol w:w="1928"/>
+        <w:gridCol w:w="1928"/>
       </w:tblGrid>
       <w:tr>
         <w:trPr>
@@ -9154,7 +10074,7 @@
         </w:trPr>
         <w:tc>
           <w:tcPr>
-            <w:tcW w:type="dxa" w:w="2409"/>
+            <w:tcW w:type="dxa" w:w="1928"/>
             <w:shd w:val="clear" w:color="auto" w:fill="0B3020"/>
           </w:tcPr>
           <w:p>
@@ -9171,7 +10091,7 @@
         </w:tc>
         <w:tc>
           <w:tcPr>
-            <w:tcW w:type="dxa" w:w="2409"/>
+            <w:tcW w:type="dxa" w:w="1928"/>
             <w:shd w:val="clear" w:color="auto" w:fill="0B3020"/>
           </w:tcPr>
           <w:p>
@@ -9188,7 +10108,7 @@
         </w:tc>
         <w:tc>
           <w:tcPr>
-            <w:tcW w:type="dxa" w:w="2409"/>
+            <w:tcW w:type="dxa" w:w="1928"/>
             <w:shd w:val="clear" w:color="auto" w:fill="0B3020"/>
           </w:tcPr>
           <w:p>
@@ -9199,13 +10119,13 @@
                 <w:color w:val="FFFFFF"/>
                 <w:sz w:val="18"/>
               </w:rPr>
-              <w:t>Source</w:t>
-            </w:r>
-          </w:p>
-        </w:tc>
-        <w:tc>
-          <w:tcPr>
-            <w:tcW w:type="dxa" w:w="2409"/>
+              <w:t>Source and page</w:t>
+            </w:r>
+          </w:p>
+        </w:tc>
+        <w:tc>
+          <w:tcPr>
+            <w:tcW w:type="dxa" w:w="1928"/>
             <w:shd w:val="clear" w:color="auto" w:fill="0B3020"/>
           </w:tcPr>
           <w:p>
@@ -9216,6 +10136,23 @@
                 <w:color w:val="FFFFFF"/>
                 <w:sz w:val="18"/>
               </w:rPr>
+              <w:t>Grade</w:t>
+            </w:r>
+          </w:p>
+        </w:tc>
+        <w:tc>
+          <w:tcPr>
+            <w:tcW w:type="dxa" w:w="1928"/>
+            <w:shd w:val="clear" w:color="auto" w:fill="0B3020"/>
+          </w:tcPr>
+          <w:p>
+            <w:r/>
+            <w:r>
+              <w:rPr>
+                <w:b/>
+                <w:color w:val="FFFFFF"/>
+                <w:sz w:val="18"/>
+              </w:rPr>
               <w:t>Status</w:t>
             </w:r>
           </w:p>
@@ -9224,7 +10161,7 @@
       <w:tr>
         <w:tc>
           <w:tcPr>
-            <w:tcW w:type="dxa" w:w="2409"/>
+            <w:tcW w:type="dxa" w:w="1928"/>
           </w:tcPr>
           <w:p>
             <w:r/>
@@ -9237,7 +10174,7 @@
         </w:tc>
         <w:tc>
           <w:tcPr>
-            <w:tcW w:type="dxa" w:w="2409"/>
+            <w:tcW w:type="dxa" w:w="1928"/>
           </w:tcPr>
           <w:p>
             <w:r/>
@@ -9250,7 +10187,7 @@
         </w:tc>
         <w:tc>
           <w:tcPr>
-            <w:tcW w:type="dxa" w:w="2409"/>
+            <w:tcW w:type="dxa" w:w="1928"/>
           </w:tcPr>
           <w:p>
             <w:r/>
@@ -9263,7 +10200,20 @@
         </w:tc>
         <w:tc>
           <w:tcPr>
-            <w:tcW w:type="dxa" w:w="2409"/>
+            <w:tcW w:type="dxa" w:w="1928"/>
+          </w:tcPr>
+          <w:p>
+            <w:r/>
+            <w:r>
+              <w:rPr>
+                <w:sz w:val="18"/>
+              </w:rPr>
+            </w:r>
+          </w:p>
+        </w:tc>
+        <w:tc>
+          <w:tcPr>
+            <w:tcW w:type="dxa" w:w="1928"/>
           </w:tcPr>
           <w:p>
             <w:r/>
@@ -9278,7 +10228,7 @@
       <w:tr>
         <w:tc>
           <w:tcPr>
-            <w:tcW w:type="dxa" w:w="2409"/>
+            <w:tcW w:type="dxa" w:w="1928"/>
           </w:tcPr>
           <w:p>
             <w:r/>
@@ -9291,7 +10241,7 @@
         </w:tc>
         <w:tc>
           <w:tcPr>
-            <w:tcW w:type="dxa" w:w="2409"/>
+            <w:tcW w:type="dxa" w:w="1928"/>
           </w:tcPr>
           <w:p>
             <w:r/>
@@ -9304,7 +10254,7 @@
         </w:tc>
         <w:tc>
           <w:tcPr>
-            <w:tcW w:type="dxa" w:w="2409"/>
+            <w:tcW w:type="dxa" w:w="1928"/>
           </w:tcPr>
           <w:p>
             <w:r/>
@@ -9317,7 +10267,20 @@
         </w:tc>
         <w:tc>
           <w:tcPr>
-            <w:tcW w:type="dxa" w:w="2409"/>
+            <w:tcW w:type="dxa" w:w="1928"/>
+          </w:tcPr>
+          <w:p>
+            <w:r/>
+            <w:r>
+              <w:rPr>
+                <w:sz w:val="18"/>
+              </w:rPr>
+            </w:r>
+          </w:p>
+        </w:tc>
+        <w:tc>
+          <w:tcPr>
+            <w:tcW w:type="dxa" w:w="1928"/>
           </w:tcPr>
           <w:p>
             <w:r/>
@@ -9332,7 +10295,7 @@
       <w:tr>
         <w:tc>
           <w:tcPr>
-            <w:tcW w:type="dxa" w:w="2409"/>
+            <w:tcW w:type="dxa" w:w="1928"/>
           </w:tcPr>
           <w:p>
             <w:r/>
@@ -9345,7 +10308,7 @@
         </w:tc>
         <w:tc>
           <w:tcPr>
-            <w:tcW w:type="dxa" w:w="2409"/>
+            <w:tcW w:type="dxa" w:w="1928"/>
           </w:tcPr>
           <w:p>
             <w:r/>
@@ -9358,7 +10321,7 @@
         </w:tc>
         <w:tc>
           <w:tcPr>
-            <w:tcW w:type="dxa" w:w="2409"/>
+            <w:tcW w:type="dxa" w:w="1928"/>
           </w:tcPr>
           <w:p>
             <w:r/>
@@ -9371,7 +10334,20 @@
         </w:tc>
         <w:tc>
           <w:tcPr>
-            <w:tcW w:type="dxa" w:w="2409"/>
+            <w:tcW w:type="dxa" w:w="1928"/>
+          </w:tcPr>
+          <w:p>
+            <w:r/>
+            <w:r>
+              <w:rPr>
+                <w:sz w:val="18"/>
+              </w:rPr>
+            </w:r>
+          </w:p>
+        </w:tc>
+        <w:tc>
+          <w:tcPr>
+            <w:tcW w:type="dxa" w:w="1928"/>
           </w:tcPr>
           <w:p>
             <w:r/>
@@ -9386,7 +10362,7 @@
       <w:tr>
         <w:tc>
           <w:tcPr>
-            <w:tcW w:type="dxa" w:w="2409"/>
+            <w:tcW w:type="dxa" w:w="1928"/>
           </w:tcPr>
           <w:p>
             <w:r/>
@@ -9399,7 +10375,7 @@
         </w:tc>
         <w:tc>
           <w:tcPr>
-            <w:tcW w:type="dxa" w:w="2409"/>
+            <w:tcW w:type="dxa" w:w="1928"/>
           </w:tcPr>
           <w:p>
             <w:r/>
@@ -9412,7 +10388,7 @@
         </w:tc>
         <w:tc>
           <w:tcPr>
-            <w:tcW w:type="dxa" w:w="2409"/>
+            <w:tcW w:type="dxa" w:w="1928"/>
           </w:tcPr>
           <w:p>
             <w:r/>
@@ -9425,7 +10401,20 @@
         </w:tc>
         <w:tc>
           <w:tcPr>
-            <w:tcW w:type="dxa" w:w="2409"/>
+            <w:tcW w:type="dxa" w:w="1928"/>
+          </w:tcPr>
+          <w:p>
+            <w:r/>
+            <w:r>
+              <w:rPr>
+                <w:sz w:val="18"/>
+              </w:rPr>
+            </w:r>
+          </w:p>
+        </w:tc>
+        <w:tc>
+          <w:tcPr>
+            <w:tcW w:type="dxa" w:w="1928"/>
           </w:tcPr>
           <w:p>
             <w:r/>
@@ -9440,7 +10429,7 @@
       <w:tr>
         <w:tc>
           <w:tcPr>
-            <w:tcW w:type="dxa" w:w="2409"/>
+            <w:tcW w:type="dxa" w:w="1928"/>
           </w:tcPr>
           <w:p>
             <w:r/>
@@ -9453,7 +10442,7 @@
         </w:tc>
         <w:tc>
           <w:tcPr>
-            <w:tcW w:type="dxa" w:w="2409"/>
+            <w:tcW w:type="dxa" w:w="1928"/>
           </w:tcPr>
           <w:p>
             <w:r/>
@@ -9466,7 +10455,7 @@
         </w:tc>
         <w:tc>
           <w:tcPr>
-            <w:tcW w:type="dxa" w:w="2409"/>
+            <w:tcW w:type="dxa" w:w="1928"/>
           </w:tcPr>
           <w:p>
             <w:r/>
@@ -9479,7 +10468,20 @@
         </w:tc>
         <w:tc>
           <w:tcPr>
-            <w:tcW w:type="dxa" w:w="2409"/>
+            <w:tcW w:type="dxa" w:w="1928"/>
+          </w:tcPr>
+          <w:p>
+            <w:r/>
+            <w:r>
+              <w:rPr>
+                <w:sz w:val="18"/>
+              </w:rPr>
+            </w:r>
+          </w:p>
+        </w:tc>
+        <w:tc>
+          <w:tcPr>
+            <w:tcW w:type="dxa" w:w="1928"/>
           </w:tcPr>
           <w:p>
             <w:r/>
@@ -9890,7 +10892,7 @@
           <w:color w:val="666666"/>
           <w:sz w:val="18"/>
         </w:rPr>
-        <w:t>Decision support template from the Africa Energy Finance Volume 2 pack. It does not constitute investment, legal, tax or accounting advice.</w:t>
+        <w:t>Decision support template from the Africa Energy Finance Book 2 Templates Pack. It does not constitute investment, legal, tax or accounting advice.</w:t>
       </w:r>
     </w:p>
     <w:sectPr>
@@ -9920,7 +10922,7 @@
         <w:color w:val="666666"/>
         <w:sz w:val="15"/>
       </w:rPr>
-      <w:t>Africa Energy Finance | Volume 2 Template T01 | Version 1.0</w:t>
+      <w:t>Africa Energy Finance | Book 2 Template T01 | Version 0.9 (pre-release)</w:t>
       <w:tab/>
       <w:tab/>
       <w:t xml:space="preserve">Page </w:t>
@@ -10000,7 +11002,7 @@
         <w:color w:val="0B3020"/>
         <w:sz w:val="15"/>
       </w:rPr>
-      <w:t>AFRICA ENERGY FINANCE  |  VOLUME 2  |  TEMPLATE T01</w:t>
+      <w:t>AFRICA ENERGY FINANCE  |  BOOK 2  |  TEMPLATE T01</w:t>
     </w:r>
     <w:r>
       <w:rPr>

</xml_diff>